<commit_message>
Rebuild seminar PPT (9 slides) and tone down report game names
PPT now follows RE background → AI-assisted RE → generic game
case study → challenges, with Mermaid diagrams and balanced text.
Report aligned to the same narrative without brand-name spam.

Co-authored-by: Ankrit <Ankritjarngal@users.noreply.github.com>
</commit_message>
<xml_diff>
--- a/seminar/Ankrit_Jarngal_2023BSE028_Seminar_Report.docx
+++ b/seminar/Ankrit_Jarngal_2023BSE028_Seminar_Report.docx
@@ -405,7 +405,7 @@
           <w:color w:val="000000"/>
           <w:sz w:val="24"/>
         </w:rPr>
-        <w:t>Software reverse engineering—the analysis of compiled binaries to recover program structure, behavior, and intent without original source code—has long been a specialist craft. Classical toolchains such as Ghidra, IDA Pro, and Binary Ninja already provide strong disassembly and decompilation, yet analysts still spend large fractions of effort on renaming, type recovery, structure layout, and navigating stripped symbols. Recent advances in large language models (LLMs) and agentic tooling are changing that bottleneck.</w:t>
+        <w:t>Software reverse engineering is the analysis of compiled binaries to recover program structure, behavior, and intent when original source code is unavailable. Classical toolchains such as Ghidra, IDA Pro, and Binary Ninja already provide strong disassembly and decompilation. Historically, however, a large share of effort still went into manual naming, type recovery, and understanding stripped symbols—making deep reverse engineering slow and expert-only.</w:t>
       </w:r>
     </w:p>
     <w:p>
@@ -422,7 +422,7 @@
           <w:color w:val="000000"/>
           <w:sz w:val="24"/>
         </w:rPr>
-        <w:t>This seminar report surveys how AI is making reverse engineering more efficient: specialized decompilation models such as LLM4Decompile, identifier and type recovery systems, and in-tool assistants (Binary Ninja Sidekick, Hex-Rays IDA Assist, GhidraMCP bridges). Measured benchmarks show substantial gains in re-executability and readability when LLMs refine classical decompiler output, while also revealing correctness gaps that demand human verification.</w:t>
+        <w:t>This seminar report first establishes that background, then examines how artificial intelligence—especially large language models and coding agents—has accelerated the pipeline. AI does not replace classical tools; it sits on top of them, drafting readable explanations, refining pseudo-code, and automating iterate-and-verify loops. Benchmarks such as LLM4Decompile show clear gains when models refine decompiler output, while also reminding us that correctness still requires human and automated verification.</w:t>
       </w:r>
     </w:p>
     <w:p>
@@ -439,24 +439,7 @@
           <w:color w:val="000000"/>
           <w:sz w:val="24"/>
         </w:rPr>
-        <w:t>Using video games as the primary case study, the report examines how modifications that once required years of expert reverse engineering—especially cross-game “mashups” built from compiled executables rather than studio source—have become comparatively practical. The central technical pattern is not rewriting a game from scratch, but instrumenting binaries through passthrough bridges, thin DLL injection, shared-memory compositing, and AI-assisted matching decompilation loops. Minecraft running inside Elden Ring, related 2026 mashup demos, and AI-accelerated console decompilation projects illustrate both the opportunity and the limits of this shift.</w:t>
-      </w:r>
-    </w:p>
-    <w:p>
-      <w:pPr>
-        <w:spacing w:after="160" w:before="0" w:line="360" w:lineRule="auto"/>
-        <w:ind w:firstLine="432"/>
-        <w:jc w:val="both"/>
-      </w:pPr>
-      <w:r>
-        <w:rPr>
-          <w:rFonts w:ascii="Times New Roman" w:hAnsi="Times New Roman" w:eastAsia="Times New Roman"/>
-          <w:b w:val="0"/>
-          <w:i w:val="0"/>
-          <w:color w:val="000000"/>
-          <w:sz w:val="24"/>
-        </w:rPr>
-        <w:t>The report concludes that AI amplifies reverse engineering productivity; it does not eliminate the need for classical analysis, verification oracles, or ethical and legal judgment around copyright, anti-cheat, and redistribution.</w:t>
+        <w:t>As the main case study, the report focuses on video games: closed, optimized binaries where deep modification once required years of specialist work. Recent projects show that systems from different games can be combined at runtime by reverse-engineering compiled processes—using bridges, hooks, and shared memory—rather than rewriting engines from scratch. AI assistance made this class of work comparatively practical. The report ends with limits: hallucinations, obfuscation, legal constraints, and ethical responsibility.</w:t>
       </w:r>
     </w:p>
     <w:p>
@@ -471,7 +454,7 @@
           <w:color w:val="000000"/>
           <w:sz w:val="24"/>
         </w:rPr>
-        <w:t>Keywords: Reverse Engineering, Decompilation, Large Language Models, Ghidra, Binary Analysis, Game Modding, Passthrough Mods, Matching Decompilation.</w:t>
+        <w:t>Keywords: Reverse Engineering, Decompilation, Large Language Models, Binary Analysis, Game Modding, AI Agents, Software Security.</w:t>
       </w:r>
     </w:p>
     <w:p>
@@ -597,7 +580,7 @@
           <w:color w:val="000000"/>
           <w:sz w:val="24"/>
         </w:rPr>
-        <w:t>•  Chapter 2: How AI Transforms Reverse Engineering</w:t>
+        <w:t>•  Chapter 2: AI-Assisted Reverse Engineering</w:t>
       </w:r>
     </w:p>
     <w:p>
@@ -612,7 +595,7 @@
           <w:color w:val="000000"/>
           <w:sz w:val="24"/>
         </w:rPr>
-        <w:t>•      2.1 Neural and LLM-Based Decompilation</w:t>
+        <w:t>•      2.1 What AI Changes in the Pipeline</w:t>
       </w:r>
     </w:p>
     <w:p>
@@ -627,7 +610,7 @@
           <w:color w:val="000000"/>
           <w:sz w:val="24"/>
         </w:rPr>
-        <w:t>•      2.2 In-Tool Assistants and Agentic Workflows</w:t>
+        <w:t>•      2.2 Tools and Agentic Workflows</w:t>
       </w:r>
     </w:p>
     <w:p>
@@ -642,7 +625,7 @@
           <w:color w:val="000000"/>
           <w:sz w:val="24"/>
         </w:rPr>
-        <w:t>•      2.3 Measured Gains and Correctness Limits</w:t>
+        <w:t>•      2.3 Evidence of Speed and Remaining Gaps</w:t>
       </w:r>
     </w:p>
     <w:p>
@@ -657,7 +640,7 @@
           <w:color w:val="000000"/>
           <w:sz w:val="24"/>
         </w:rPr>
-        <w:t>•  Chapter 3: Why Video Games Are the Right Case Study</w:t>
+        <w:t>•  Chapter 3: Why Video Games Are the Case Study</w:t>
       </w:r>
     </w:p>
     <w:p>
@@ -672,7 +655,7 @@
           <w:color w:val="000000"/>
           <w:sz w:val="24"/>
         </w:rPr>
-        <w:t>•      3.1 Closed Engines and Missing Source</w:t>
+        <w:t>•      3.1 Closed Binaries and Limited APIs</w:t>
       </w:r>
     </w:p>
     <w:p>
@@ -687,7 +670,7 @@
           <w:color w:val="000000"/>
           <w:sz w:val="24"/>
         </w:rPr>
-        <w:t>•      3.2 Pre-AI Effort versus Post-AI Acceleration</w:t>
+        <w:t>•      3.2 From Expert-Only Work to Faster Iteration</w:t>
       </w:r>
     </w:p>
     <w:p>
@@ -717,7 +700,7 @@
           <w:color w:val="000000"/>
           <w:sz w:val="24"/>
         </w:rPr>
-        <w:t>•      4.1 Passthrough and Shared-Memory Bridges</w:t>
+        <w:t>•      4.1 Passthrough Bridges</w:t>
       </w:r>
     </w:p>
     <w:p>
@@ -732,7 +715,7 @@
           <w:color w:val="000000"/>
           <w:sz w:val="24"/>
         </w:rPr>
-        <w:t>•      4.2 Native Injection and Thin Hooks</w:t>
+        <w:t>•      4.2 Native Injection and Hooks</w:t>
       </w:r>
     </w:p>
     <w:p>
@@ -747,7 +730,7 @@
           <w:color w:val="000000"/>
           <w:sz w:val="24"/>
         </w:rPr>
-        <w:t>•      4.3 Decomp-as-Library and Matching Agent Loops</w:t>
+        <w:t>•      4.3 Decompilation-Assisted Reuse</w:t>
       </w:r>
     </w:p>
     <w:p>
@@ -762,7 +745,7 @@
           <w:color w:val="000000"/>
           <w:sz w:val="24"/>
         </w:rPr>
-        <w:t>•  Chapter 5: Case Study — Games Inside Games</w:t>
+        <w:t>•  Chapter 5: Case Study — Cross-Game Binary Bridges</w:t>
       </w:r>
     </w:p>
     <w:p>
@@ -777,7 +760,7 @@
           <w:color w:val="000000"/>
           <w:sz w:val="24"/>
         </w:rPr>
-        <w:t>•      5.1 Minecraft inside Elden Ring</w:t>
+        <w:t>•      5.1 Problem Setting</w:t>
       </w:r>
     </w:p>
     <w:p>
@@ -792,7 +775,7 @@
           <w:color w:val="000000"/>
           <w:sz w:val="24"/>
         </w:rPr>
-        <w:t>•      5.2 The 2026 Mashup Wave and Related Work</w:t>
+        <w:t>•      5.2 Architecture of a Runtime Bridge</w:t>
       </w:r>
     </w:p>
     <w:p>
@@ -807,7 +790,7 @@
           <w:color w:val="000000"/>
           <w:sz w:val="24"/>
         </w:rPr>
-        <w:t>•      5.3 What Became Easier—and What Did Not</w:t>
+        <w:t>•      5.3 Role of AI in Making It Practical</w:t>
       </w:r>
     </w:p>
     <w:p>
@@ -822,7 +805,7 @@
           <w:color w:val="000000"/>
           <w:sz w:val="24"/>
         </w:rPr>
-        <w:t>•  Chapter 6: Limitations, Ethics, and Open Challenges</w:t>
+        <w:t>•  Chapter 6: Challenges, Limits, and Ethics</w:t>
       </w:r>
     </w:p>
     <w:p>
@@ -837,7 +820,7 @@
           <w:color w:val="000000"/>
           <w:sz w:val="24"/>
         </w:rPr>
-        <w:t>•      6.1 Hallucinations, Obfuscation, and Verification</w:t>
+        <w:t>•      6.1 Correctness and Obfuscation</w:t>
       </w:r>
     </w:p>
     <w:p>
@@ -852,7 +835,7 @@
           <w:color w:val="000000"/>
           <w:sz w:val="24"/>
         </w:rPr>
-        <w:t>•      6.2 Copyright, Anti-Cheat, and Community Norms</w:t>
+        <w:t>•      6.2 Legal and Ethical Boundaries</w:t>
       </w:r>
     </w:p>
     <w:p>
@@ -951,7 +934,7 @@
           <w:color w:val="000000"/>
           <w:sz w:val="24"/>
         </w:rPr>
-        <w:t>Figure 2.1: AI-augmented RE pipeline (classical tools + LLM refine + verify).</w:t>
+        <w:t>Figure 2.1: AI-augmented RE pipeline on top of classical tools.</w:t>
       </w:r>
     </w:p>
     <w:p>
@@ -967,7 +950,7 @@
           <w:color w:val="000000"/>
           <w:sz w:val="24"/>
         </w:rPr>
-        <w:t>Figure 4.1: Passthrough bridge architecture for two concurrent games.</w:t>
+        <w:t>Figure 4.1: Passthrough bridge between two compiled game processes.</w:t>
       </w:r>
     </w:p>
     <w:p>
@@ -983,7 +966,7 @@
           <w:color w:val="000000"/>
           <w:sz w:val="24"/>
         </w:rPr>
-        <w:t>Figure 5.1: Conceptual data flow in a Minecraft–Elden Ring style bridge.</w:t>
+        <w:t>Figure 5.1: Data flow in a cross-game runtime bridge.</w:t>
       </w:r>
     </w:p>
     <w:p>
@@ -1015,7 +998,7 @@
           <w:color w:val="000000"/>
           <w:sz w:val="24"/>
         </w:rPr>
-        <w:t>Table 2.1: Selected benchmark results for AI-assisted decompilation.</w:t>
+        <w:t>Table 2.1: Selected results for AI-assisted decompilation.</w:t>
       </w:r>
     </w:p>
     <w:p>
@@ -1031,7 +1014,7 @@
           <w:color w:val="000000"/>
           <w:sz w:val="24"/>
         </w:rPr>
-        <w:t>Table 4.1: Comparison of compiled-game mashup techniques.</w:t>
+        <w:t>Table 4.1: Comparison of compiled-game modification techniques.</w:t>
       </w:r>
     </w:p>
     <w:p>
@@ -1047,7 +1030,7 @@
           <w:color w:val="000000"/>
           <w:sz w:val="24"/>
         </w:rPr>
-        <w:t>Table 5.1: Case-study examples and their enabling techniques.</w:t>
+        <w:t>Table 5.1: Case-study elements and enabling techniques.</w:t>
       </w:r>
     </w:p>
     <w:p>
@@ -1207,36 +1190,6 @@
       </w:r>
     </w:p>
     <w:p>
-      <w:pPr>
-        <w:spacing w:after="60"/>
-      </w:pPr>
-      <w:r>
-        <w:rPr>
-          <w:rFonts w:ascii="Times New Roman" w:hAnsi="Times New Roman" w:eastAsia="Times New Roman"/>
-          <w:b w:val="0"/>
-          <w:i w:val="0"/>
-          <w:color w:val="000000"/>
-          <w:sz w:val="24"/>
-        </w:rPr>
-        <w:t>•  ROM: Read-Only Memory (console game image)</w:t>
-      </w:r>
-    </w:p>
-    <w:p>
-      <w:pPr>
-        <w:spacing w:after="60"/>
-      </w:pPr>
-      <w:r>
-        <w:rPr>
-          <w:rFonts w:ascii="Times New Roman" w:hAnsi="Times New Roman" w:eastAsia="Times New Roman"/>
-          <w:b w:val="0"/>
-          <w:i w:val="0"/>
-          <w:color w:val="000000"/>
-          <w:sz w:val="24"/>
-        </w:rPr>
-        <w:t>•  SCA: Software Composition Analysis</w:t>
-      </w:r>
-    </w:p>
-    <w:p>
       <w:r>
         <w:br w:type="page"/>
       </w:r>
@@ -1286,7 +1239,7 @@
           <w:color w:val="000000"/>
           <w:sz w:val="24"/>
         </w:rPr>
-        <w:t>Reverse engineering (RE) is the disciplined analysis of a finished software artifact—typically a compiled binary—to recover design decisions, algorithms, data formats, and behaviors that are not available as original source code. In security research, interoperability work, digital preservation, and game modding, RE is often the only practical path when vendors ship closed executables (Eagle, 2011; Hex-Rays, 2025).</w:t>
+        <w:t>Reverse engineering (RE) is the disciplined analysis of a finished software artifact—typically a compiled binary—to recover design decisions, algorithms, data formats, and behaviors that are not available as original source code (Eagle, 2011). In security research, interoperability work, digital preservation, and software modification, RE is often the only practical path when vendors ship closed executables.</w:t>
       </w:r>
     </w:p>
     <w:p>
@@ -1303,7 +1256,7 @@
           <w:color w:val="000000"/>
           <w:sz w:val="24"/>
         </w:rPr>
-        <w:t>Critically, reverse engineering is not the same as rewriting a program from scratch. The binary already encodes control flow, calling conventions, and data layouts. The analyst’s job is to interpret and, when appropriate, instrument that existing machine code. This distinction is central to the present seminar: recent “game inside a game” demos succeed because they operate on compiled processes, not because an AI regenerates two full game engines as clean greenfield projects.</w:t>
+        <w:t>Critically, reverse engineering is not the same as rewriting a program from scratch. The binary already encodes control flow, calling conventions, and data layouts. The analyst’s job is to interpret and, when appropriate, instrument that existing machine code. This distinction frames the rest of the seminar: recent advances succeed because they operate on compiled processes more efficiently, not because AI invents full applications from nothing.</w:t>
       </w:r>
     </w:p>
     <w:p>
@@ -1335,7 +1288,7 @@
           <w:color w:val="000000"/>
           <w:sz w:val="24"/>
         </w:rPr>
-        <w:t>A conventional static/dynamic reverse-engineering workflow proceeds roughly as follows (Eagle, 2011; Ghidra, 2024):</w:t>
+        <w:t>A conventional reverse-engineering workflow proceeds roughly as follows (Eagle, 2011; Ghidra, 2024):</w:t>
       </w:r>
     </w:p>
     <w:p>
@@ -1351,7 +1304,7 @@
           <w:color w:val="000000"/>
           <w:sz w:val="24"/>
         </w:rPr>
-        <w:t>Ingest the binary (PE/ELF/Mach-O or console ROM) and identify architecture, compiler, and packing.</w:t>
+        <w:t>Ingest the binary and identify architecture, compiler, and packing.</w:t>
       </w:r>
     </w:p>
     <w:p>
@@ -1383,7 +1336,7 @@
           <w:color w:val="000000"/>
           <w:sz w:val="24"/>
         </w:rPr>
-        <w:t>Decompile intermediate representations into pseudo-C (Ghidra P-Code, Hex-Rays, Binary Ninja HLIL).</w:t>
+        <w:t>Decompile intermediate representations into pseudo-C.</w:t>
       </w:r>
     </w:p>
     <w:p>
@@ -1399,7 +1352,7 @@
           <w:color w:val="000000"/>
           <w:sz w:val="24"/>
         </w:rPr>
-        <w:t>Recover imports, RTTI, strings, and signature-matched library functions.</w:t>
+        <w:t>Recover imports, strings, and signature-matched library functions.</w:t>
       </w:r>
     </w:p>
     <w:p>
@@ -1415,7 +1368,7 @@
           <w:color w:val="000000"/>
           <w:sz w:val="24"/>
         </w:rPr>
-        <w:t>Perform dynamic analysis with a debugger or instrumentation framework (e.g., Frida).</w:t>
+        <w:t>Optionally perform dynamic analysis with a debugger or instrumentation.</w:t>
       </w:r>
     </w:p>
     <w:p>
@@ -1431,7 +1384,7 @@
           <w:color w:val="000000"/>
           <w:sz w:val="24"/>
         </w:rPr>
-        <w:t>Apply human judgment to name functions, define structures, and form a narrative of behavior.</w:t>
+        <w:t>Apply human judgment to name functions, define structures, and form a behavioral narrative.</w:t>
       </w:r>
     </w:p>
     <w:p>
@@ -1448,7 +1401,7 @@
           <w:color w:val="000000"/>
           <w:sz w:val="24"/>
         </w:rPr>
-        <w:t>This pipeline is powerful and largely deterministic, but it remains labor-intensive. Stripped binaries present opaque names such as sub_401000 and local_28. Structure fields appear as raw offsets. Optimized code (-O2/-O3) further obscures original developer intent. Hours of expert attention are often spent before any higher-level modification—such as a stable game hook—can be written safely.</w:t>
+        <w:t>This pipeline is powerful and largely deterministic, but it remains labor-intensive. Stripped binaries present opaque names. Structure fields appear as raw offsets. Optimized code further obscures original intent. Hours or weeks of expert attention are often spent before any higher-level modification can be written safely. That human bottleneck is exactly where AI assistance has the largest impact.</w:t>
       </w:r>
     </w:p>
     <w:p>
@@ -1465,7 +1418,7 @@
           <w:color w:val="000000"/>
           <w:sz w:val="20"/>
         </w:rPr>
-        <w:t>[ Binary PE/ELF/ROM ]</w:t>
+        <w:t>[ Compiled Binary ]</w:t>
         <w:br/>
         <w:t xml:space="preserve">        |</w:t>
         <w:br/>
@@ -1477,7 +1430,7 @@
         <w:br/>
         <w:t xml:space="preserve">        v</w:t>
         <w:br/>
-        <w:t>[ Symbol/Type Recovery ] ---&gt; [ Dynamic Checks ] ---&gt; [ Human Insight ]</w:t>
+        <w:t>[ Manual Naming / Types ] ---&gt; [ Insight or Modification ]</w:t>
       </w:r>
     </w:p>
     <w:p>
@@ -1514,7 +1467,7 @@
           <w:color w:val="000000"/>
           <w:sz w:val="28"/>
         </w:rPr>
-        <w:t>CHAPTER 2: HOW AI TRANSFORMS REVERSE ENGINEERING</w:t>
+        <w:t>CHAPTER 2: AI-ASSISTED REVERSE ENGINEERING</w:t>
       </w:r>
     </w:p>
     <w:p>
@@ -1530,7 +1483,7 @@
           <w:color w:val="000000"/>
           <w:sz w:val="26"/>
         </w:rPr>
-        <w:t>2.1 Neural and LLM-Based Decompilation</w:t>
+        <w:t>2.1 What AI Changes in the Pipeline</w:t>
       </w:r>
     </w:p>
     <w:p>
@@ -1546,7 +1499,7 @@
           <w:color w:val="000000"/>
           <w:sz w:val="24"/>
         </w:rPr>
-        <w:t>Large language models trained on paired assembly and source have opened a new track of neural decompilation. LLM4Decompile (Tan et al., 2024) released open models ranging from 1.3B to 33B parameters in two styles: End models that map binary/assembly directly toward C, and Ref models that refine pseudo-C already produced by Ghidra. On the HumanEval-Decompile benchmark, the End-6.7B model reported about 45.4% average re-executability, more than doubling GPT-4o’s roughly 16% in the authors’ comparison; refining Ghidra with Ref models raised re-executability from about 20% (Ghidra alone) toward the low-to-mid 50% range for mid-size Ref variants (Tan et al., 2024).</w:t>
+        <w:t>AI-assisted reverse engineering keeps classical tools as the foundation and adds a productivity layer on top. Large language models read decompiler output and propose meaningful names, types, comments, and structural hypotheses. Specialized decompilation models can also refine pseudo-C so that it becomes closer to re-executable source (Tan et al., 2024).</w:t>
       </w:r>
     </w:p>
     <w:p>
@@ -1563,7 +1516,7 @@
           <w:color w:val="000000"/>
           <w:sz w:val="24"/>
         </w:rPr>
-        <w:t>Parallel research recovers developer-facing identifiers rather than full recompilation. Systems such as DIRE and DIRTY demonstrated substantial exact-match rates for variable names and types from decompiler ASTs (Lacomis et al., 2019; Chen et al., 2022). ReSym combines LLMs with constrained reasoning to recover user-defined structures from stripped binaries (Xie et al., 2024). These results matter operationally: readable names and types compress the time an analyst needs before writing a patch or hook.</w:t>
+        <w:t>The practical effect is compression of analysis time: analysts spend less effort on mechanical renaming and more on verifying behavior and designing safe modifications. AI drafts; classical analysis engines still measure bytes and control flow; humans approve.</w:t>
       </w:r>
     </w:p>
     <w:p>
@@ -1579,7 +1532,7 @@
           <w:color w:val="000000"/>
           <w:sz w:val="26"/>
         </w:rPr>
-        <w:t>2.2 In-Tool Assistants and Agentic Workflows</w:t>
+        <w:t>2.2 Tools and Agentic Workflows</w:t>
       </w:r>
     </w:p>
     <w:p>
@@ -1595,7 +1548,7 @@
           <w:color w:val="000000"/>
           <w:sz w:val="24"/>
         </w:rPr>
-        <w:t>Industrial adoption has concentrated less on replacing Hex-Rays or Ghidra and more on embedding AI inside those environments. Binary Ninja Sidekick offers structure recovery, renaming, summarization, and evidence-linked investigation inside the decompiler UI (Vector 35, 2024). Hex-Rays has introduced IDA Assist as an in-GUI harness and an official MCP server so external coding agents can query databases and propose renames or patches under analyst approval (Hex-Rays, 2025). Community bridges such as GhidraMCP expose decompilation, cross-references, and renaming to agent clients (Wired, 2025).</w:t>
+        <w:t>Industrial adoption has concentrated on embedding AI inside existing environments. Assistants inside commercial decompilers can recover structures, summarize functions, and investigate questions with links back to intermediate language (Vector 35, 2024; Hex-Rays, 2025). Bridges such as Model Context Protocol servers expose Ghidra or IDA databases to coding agents, enabling autonomous navigation, renaming, and scripted checks (Wired, 2025).</w:t>
       </w:r>
     </w:p>
     <w:p>
@@ -1612,7 +1565,7 @@
           <w:color w:val="000000"/>
           <w:sz w:val="24"/>
         </w:rPr>
-        <w:t>The emerging pattern is agentic reverse engineering: an LLM proposes hypotheses, calls tools, and iterates, while classical analysis engines remain the source of truth for bytes and control flow. For game decompilation projects, the same pattern appears as a closed loop—propose C, compile with the original toolchain, diff against the target object—rather than free-form chat about assembly (Lewis, 2026; reversedwithai, 2026).</w:t>
+        <w:t>In stronger workflows, an agent proposes a change, compiles or diffs against the target binary, and retries until a verification oracle passes. This pattern is especially visible in game preservation projects that demand byte-identical matching (Lewis, 2026; reversedwithai, 2026).</w:t>
       </w:r>
     </w:p>
     <w:p>
@@ -1629,15 +1582,13 @@
           <w:color w:val="000000"/>
           <w:sz w:val="20"/>
         </w:rPr>
-        <w:t>Binary --&gt; [Ghidra / IDA / Binary Ninja] --&gt; Pseudo-C / IL</w:t>
+        <w:t>Binary --&gt; [Ghidra / IDA / Binary Ninja] --&gt; Pseudo-C</w:t>
         <w:br/>
-        <w:t xml:space="preserve">       --&gt; [LLM rename / retype / refine]</w:t>
+        <w:t xml:space="preserve">       --&gt; [LLM rename / explain / refine]</w:t>
         <w:br/>
-        <w:t xml:space="preserve">       --&gt; [Agent via MCP / scripts]</w:t>
+        <w:t xml:space="preserve">       --&gt; [Agent iterates with checks]</w:t>
         <w:br/>
-        <w:t xml:space="preserve">       --&gt; [Verify: rebuild, objdiff, emulate]</w:t>
-        <w:br/>
-        <w:t xml:space="preserve">       --&gt; Human-approved insight or hook</w:t>
+        <w:t xml:space="preserve">       --&gt; Human-approved understanding or hook</w:t>
       </w:r>
     </w:p>
     <w:p>
@@ -1653,7 +1604,7 @@
           <w:color w:val="000000"/>
           <w:sz w:val="22"/>
         </w:rPr>
-        <w:t>Figure 2.1: AI-augmented RE pipeline (classical tools + LLM refine + verify).</w:t>
+        <w:t>Figure 2.1: AI-augmented RE pipeline on top of classical tools.</w:t>
       </w:r>
     </w:p>
     <w:p>
@@ -1669,7 +1620,7 @@
           <w:color w:val="000000"/>
           <w:sz w:val="26"/>
         </w:rPr>
-        <w:t>2.3 Measured Gains and Correctness Limits</w:t>
+        <w:t>2.3 Evidence of Speed and Remaining Gaps</w:t>
       </w:r>
     </w:p>
     <w:p>
@@ -1685,7 +1636,24 @@
           <w:color w:val="000000"/>
           <w:sz w:val="24"/>
         </w:rPr>
-        <w:t>AI improvements are real but uneven. DecompileBench (2025) reports that LLM-based methods can outperform commercial tools on perceived understandability while showing substantially lower functional correctness on some metrics—illustrating the risk of plausible but wrong code (DecompileBench authors, 2025). Obfuscation techniques such as control-flow flattening still collapse many LLM decompilation successes. Therefore, responsible practice treats AI output as a draft requiring an oracle: re-execution tests, byte-identical matching, or independent review.</w:t>
+        <w:t>LLM4Decompile reported substantial re-executability gains for models that either decompile directly or refine Ghidra output, outperforming generic chat models on the authors’ benchmarks (Tan et al., 2024). Related work on identifier recovery shows that names and types can often be restored at useful accuracy from decompiler ASTs (Chen et al., 2022).</w:t>
+      </w:r>
+    </w:p>
+    <w:p>
+      <w:pPr>
+        <w:spacing w:after="160" w:before="0" w:line="360" w:lineRule="auto"/>
+        <w:ind w:firstLine="432"/>
+        <w:jc w:val="both"/>
+      </w:pPr>
+      <w:r>
+        <w:rPr>
+          <w:rFonts w:ascii="Times New Roman" w:hAnsi="Times New Roman" w:eastAsia="Times New Roman"/>
+          <w:b w:val="0"/>
+          <w:i w:val="0"/>
+          <w:color w:val="000000"/>
+          <w:sz w:val="24"/>
+        </w:rPr>
+        <w:t>Gaps remain. Broader evaluations warn that LLM output can look readable while being functionally wrong (DecompileBench authors, 2025). Obfuscation still collapses many automated successes. Therefore speed without verification is not progress—it is risk.</w:t>
       </w:r>
     </w:p>
     <w:p>
@@ -1701,7 +1669,7 @@
           <w:color w:val="000000"/>
           <w:sz w:val="22"/>
         </w:rPr>
-        <w:t>Table 2.1: Selected benchmark results for AI-assisted decompilation.</w:t>
+        <w:t>Table 2.1: Selected results for AI-assisted decompilation.</w:t>
       </w:r>
     </w:p>
     <w:tbl>
@@ -1786,7 +1754,7 @@
                 <w:color w:val="000000"/>
                 <w:sz w:val="20"/>
               </w:rPr>
-              <w:t>LLM4Decompile-End-6.7B</w:t>
+              <w:t>LLM4Decompile-End</w:t>
             </w:r>
           </w:p>
         </w:tc>
@@ -1804,7 +1772,7 @@
                 <w:color w:val="000000"/>
                 <w:sz w:val="20"/>
               </w:rPr>
-              <w:t>HumanEval re-executability</w:t>
+              <w:t>Re-executability (HumanEval-Decompile)</w:t>
             </w:r>
           </w:p>
         </w:tc>
@@ -1822,7 +1790,7 @@
                 <w:color w:val="000000"/>
                 <w:sz w:val="20"/>
               </w:rPr>
-              <w:t>~45.4% vs GPT-4o ~16%</w:t>
+              <w:t>~45% (vs ~16% GPT-4o in paper)</w:t>
             </w:r>
           </w:p>
         </w:tc>
@@ -1860,7 +1828,7 @@
                 <w:color w:val="000000"/>
                 <w:sz w:val="20"/>
               </w:rPr>
-              <w:t>HumanEval re-executability</w:t>
+              <w:t>Re-executability</w:t>
             </w:r>
           </w:p>
         </w:tc>
@@ -1898,7 +1866,7 @@
                 <w:color w:val="000000"/>
                 <w:sz w:val="20"/>
               </w:rPr>
-              <w:t>LLM4Decompile-Ref on Ghidra</w:t>
+              <w:t>Ghidra + LLM refine</w:t>
             </w:r>
           </w:p>
         </w:tc>
@@ -1916,7 +1884,7 @@
                 <w:color w:val="000000"/>
                 <w:sz w:val="20"/>
               </w:rPr>
-              <w:t>HumanEval re-executability</w:t>
+              <w:t>Re-executability</w:t>
             </w:r>
           </w:p>
         </w:tc>
@@ -1934,7 +1902,7 @@
                 <w:color w:val="000000"/>
                 <w:sz w:val="20"/>
               </w:rPr>
-              <w:t>~53% (6.7B Ref)</w:t>
+              <w:t>~53% (mid-size Ref model)</w:t>
             </w:r>
           </w:p>
         </w:tc>
@@ -1954,7 +1922,7 @@
                 <w:color w:val="000000"/>
                 <w:sz w:val="20"/>
               </w:rPr>
-              <w:t>DIRTY</w:t>
+              <w:t>DIRTY-style recovery</w:t>
             </w:r>
           </w:p>
         </w:tc>
@@ -1972,7 +1940,7 @@
                 <w:color w:val="000000"/>
                 <w:sz w:val="20"/>
               </w:rPr>
-              <w:t>Variable name / type exact match</w:t>
+              <w:t>Names / types</w:t>
             </w:r>
           </w:p>
         </w:tc>
@@ -1990,7 +1958,7 @@
                 <w:color w:val="000000"/>
                 <w:sz w:val="20"/>
               </w:rPr>
-              <w:t>~66% / ~76%</w:t>
+              <w:t>Often majority exact-match on benchmarks</w:t>
             </w:r>
           </w:p>
         </w:tc>
@@ -2010,7 +1978,7 @@
                 <w:color w:val="000000"/>
                 <w:sz w:val="20"/>
               </w:rPr>
-              <w:t>DecompileBench (2025)</w:t>
+              <w:t>DecompileBench</w:t>
             </w:r>
           </w:p>
         </w:tc>
@@ -2028,7 +1996,7 @@
                 <w:color w:val="000000"/>
                 <w:sz w:val="20"/>
               </w:rPr>
-              <w:t>LLM vs commercial correctness</w:t>
+              <w:t>Readability vs correctness</w:t>
             </w:r>
           </w:p>
         </w:tc>
@@ -2046,7 +2014,7 @@
                 <w:color w:val="000000"/>
                 <w:sz w:val="20"/>
               </w:rPr>
-              <w:t>Readability up; CER can drop ~52%</w:t>
+              <w:t>Readability can rise while correctness drops</w:t>
             </w:r>
           </w:p>
         </w:tc>
@@ -2071,7 +2039,7 @@
           <w:color w:val="000000"/>
           <w:sz w:val="28"/>
         </w:rPr>
-        <w:t>CHAPTER 3: WHY VIDEO GAMES ARE THE RIGHT CASE STUDY</w:t>
+        <w:t>CHAPTER 3: WHY VIDEO GAMES ARE THE CASE STUDY</w:t>
       </w:r>
     </w:p>
     <w:p>
@@ -2087,7 +2055,7 @@
           <w:color w:val="000000"/>
           <w:sz w:val="26"/>
         </w:rPr>
-        <w:t>3.1 Closed Engines and Missing Source</w:t>
+        <w:t>3.1 Closed Binaries and Limited APIs</w:t>
       </w:r>
     </w:p>
     <w:p>
@@ -2103,7 +2071,7 @@
           <w:color w:val="000000"/>
           <w:sz w:val="24"/>
         </w:rPr>
-        <w:t>Commercial games are an extreme RE setting. Engines ship as optimized native binaries, often with custom allocators, proprietary serialization, GPU command buffers, and anti-tamper or anti-cheat layers. Official modding APIs—when they exist—expose only curated surfaces. Anything deeper (camera matrices, collision queries, damage application, frame presentation) usually requires locating addresses and calling conventions inside the compiled image (Fox, 2024).</w:t>
+        <w:t>Commercial games are an extreme reverse-engineering setting. Engines ship as optimized native binaries, often with custom allocators, proprietary formats, GPU command submission, and anti-tamper layers. Official modding APIs—when they exist—expose only curated surfaces. Anything deeper (camera matrices, collision queries, damage application, frame presentation) usually requires locating addresses and calling conventions inside the compiled image.</w:t>
       </w:r>
     </w:p>
     <w:p>
@@ -2120,7 +2088,7 @@
           <w:color w:val="000000"/>
           <w:sz w:val="24"/>
         </w:rPr>
-        <w:t>This is why game case studies clarify the seminar thesis. Asset swaps and scripted plugin mods (for example, historical Mario Kart–themed Counter-Strike maps built with server plugins) are not the same class of problem as merging two live engines. The latter demands reverse engineering of compiled behavior: hooks, shared memory protocols, and renderer compositing (Bustin, 2026; Sheikh, 2026).</w:t>
+        <w:t>That is why games clarify the seminar thesis. Simple scripted plugins that use documented APIs are not the same class of problem as merging two live compiled engines. The latter demands reverse engineering of binary behavior: hooks, shared-memory protocols, and renderer compositing.</w:t>
       </w:r>
     </w:p>
     <w:p>
@@ -2136,7 +2104,7 @@
           <w:color w:val="000000"/>
           <w:sz w:val="26"/>
         </w:rPr>
-        <w:t>3.2 Pre-AI Effort versus Post-AI Acceleration</w:t>
+        <w:t>3.2 From Expert-Only Work to Faster Iteration</w:t>
       </w:r>
     </w:p>
     <w:p>
@@ -2152,7 +2120,7 @@
           <w:color w:val="000000"/>
           <w:sz w:val="24"/>
         </w:rPr>
-        <w:t>Matching decompilation communities spent years recovering Super Mario 64, The Legend of Zelda: Ocarina of Time, and Mario Kart Wii into byte-identical C projects. Those efforts built essential tooling—splat, m2c, decomp.me, decomp-permuter, objdiff—but progress was human-limited function by function (sm64 decomp community; riidefi mkw work).</w:t>
+        <w:t>Matching decompilation communities historically spent years recovering classic console titles into byte-identical C projects. Those efforts built essential tooling, but progress was human-limited function by function. AI coding agents now sit on top of that toolchain: propose C, compile with the original compiler, diff against the target object, and retry (Lewis, 2026). Separately, static recompilation turns old binaries into portable code for modern platforms (Wiseguy, 2024).</w:t>
       </w:r>
     </w:p>
     <w:p>
@@ -2169,7 +2137,7 @@
           <w:color w:val="000000"/>
           <w:sz w:val="24"/>
         </w:rPr>
-        <w:t>AI coding agents now sit on top of that toolchain. Reports from Snowboard Kids 2 and related projects describe headless agent loops that pick an unmatched function, attempt C, compile, and diff until match or timeout—with multi-week agent runs sometimes outpacing months of manual matching (Lewis, 2026). Separately, static recompilation projects such as N64: Recompiled translate console binaries into portable C for modern ports (Wiseguy, 2024). Together, these advances lower the cost of understanding and reusing compiled game logic—the prerequisite for ambitious mashups.</w:t>
+        <w:t>Together, these advances lower the cost of understanding and reusing compiled game logic—the prerequisite for ambitious runtime bridges that were previously near-impossible outside specialist teams.</w:t>
       </w:r>
     </w:p>
     <w:p>
@@ -2206,7 +2174,7 @@
           <w:color w:val="000000"/>
           <w:sz w:val="26"/>
         </w:rPr>
-        <w:t>4.1 Passthrough and Shared-Memory Bridges</w:t>
+        <w:t>4.1 Passthrough Bridges</w:t>
       </w:r>
     </w:p>
     <w:p>
@@ -2222,7 +2190,7 @@
           <w:color w:val="000000"/>
           <w:sz w:val="24"/>
         </w:rPr>
-        <w:t>Passthrough modding runs two games concurrently. One process typically owns the world (terrain, enemies, lighting); the other owns player mechanics or a second renderer. A bridge—often a Fabric/Java mod on one side and a native DLL on the other—exchanges camera pose, collision rays, entity proxies, and damage events over shared memory or local IPC. At present time, guest pixels are depth-tested into the host swapchain so blocks appear behind walls correctly (Bustin, 2026; MartianLee, 2026).</w:t>
+        <w:t>Passthrough modding runs two games concurrently. One process typically owns the world (terrain, enemies, lighting); the other owns player mechanics or a second renderer. A bridge—often a script/mod on one side and a native library on the other—exchanges camera pose, collision rays, entity proxies, and damage events over shared memory or local IPC. At present time, guest pixels can be depth-tested into the host frame so both worlds appear coherent (open bridge implementations, 2026).</w:t>
       </w:r>
     </w:p>
     <w:p>
@@ -2239,17 +2207,19 @@
           <w:color w:val="000000"/>
           <w:sz w:val="20"/>
         </w:rPr>
-        <w:t>Guest Game (e.g., Minecraft)          Host Game (e.g., Elden Ring)</w:t>
+        <w:t>Guest Game Process                 Host Game Process</w:t>
         <w:br/>
-        <w:t xml:space="preserve">  Fabric/native mod  --camera/frames--&gt;  Bridge DLL (hooks Present)</w:t>
+        <w:t xml:space="preserve">  player systems / logic  &lt;----&gt;   world / physics / renderer</w:t>
         <w:br/>
-        <w:t xml:space="preserve">                 &lt;--ray hits/HP/entities--</w:t>
+        <w:t xml:space="preserve">                 \               /</w:t>
         <w:br/>
-        <w:t xml:space="preserve">                 --damage events--------&gt;</w:t>
+        <w:t xml:space="preserve">                  Bridge Layer</w:t>
         <w:br/>
-        <w:t xml:space="preserve">         Shared memory / IPC files</w:t>
+        <w:t xml:space="preserve">           hooks · shared memory · IPC</w:t>
         <w:br/>
-        <w:t xml:space="preserve">  Depth-composite guest RGBA into host frame</w:t>
+        <w:t xml:space="preserve">                       |</w:t>
+        <w:br/>
+        <w:t xml:space="preserve">            Single composited frame</w:t>
       </w:r>
     </w:p>
     <w:p>
@@ -2265,7 +2235,7 @@
           <w:color w:val="000000"/>
           <w:sz w:val="22"/>
         </w:rPr>
-        <w:t>Figure 4.1: Passthrough bridge architecture for two concurrent games.</w:t>
+        <w:t>Figure 4.1: Passthrough bridge between two compiled game processes.</w:t>
       </w:r>
     </w:p>
     <w:p>
@@ -2281,7 +2251,7 @@
           <w:color w:val="000000"/>
           <w:sz w:val="26"/>
         </w:rPr>
-        <w:t>4.2 Native Injection and Thin Hooks</w:t>
+        <w:t>4.2 Native Injection and Hooks</w:t>
       </w:r>
     </w:p>
     <w:p>
@@ -2297,7 +2267,7 @@
           <w:color w:val="000000"/>
           <w:sz w:val="24"/>
         </w:rPr>
-        <w:t>When only one host process should remain authoritative, modders inject a minimal DLL (for example via a dinput8.dll proxy or a loader such as ModEngine2/me3), hook rendering or gameplay functions with libraries like MinHook, and push heavy work to an external daemon. Design goals emphasize crash isolation and small in-process footprints (Altimit, 2026). AI agents accelerate the search for stable byte patterns, RTTI names, and call sites, especially when paired with live memory tools exposed over agent protocols.</w:t>
+        <w:t>When only one host process should remain authoritative, modders inject a minimal library, hook rendering or gameplay functions, and push heavy work to an external helper process. Design goals emphasize crash isolation and small in-process footprints. AI agents accelerate searching for stable byte patterns, class metadata, and call sites—especially when paired with live memory inspection tools.</w:t>
       </w:r>
     </w:p>
     <w:p>
@@ -2313,7 +2283,7 @@
           <w:color w:val="000000"/>
           <w:sz w:val="26"/>
         </w:rPr>
-        <w:t>4.3 Decomp-as-Library and Matching Agent Loops</w:t>
+        <w:t>4.3 Decompilation-Assisted Reuse</w:t>
       </w:r>
     </w:p>
     <w:p>
@@ -2329,7 +2299,7 @@
           <w:color w:val="000000"/>
           <w:sz w:val="24"/>
         </w:rPr>
-        <w:t>A third route uses community decompilations as libraries. Super Mario 64’s matching decomp enables projects that embed Mario’s physics inside other hosts without redistributing Nintendo assets—builders supply their own ROM (sm64 community; Game Pixel AI survey, 2026). Matching agent loops for ongoing decomps follow a strict oracle: the original compiler is fixed; inline assembly cheats and edited verification scripts are rejected (reversedwithai, 2026). This discipline is what turns AI speed into trustworthy preservation rather than unverifiable guesses.</w:t>
+        <w:t>A third route uses community matching decompilations as libraries: recovered C that recompiles to the original bytes can be linked into new hosts for preservation or experimental composition. Matching agent loops follow a strict oracle—the original compiler is fixed—so AI speed becomes trustworthy only when verification cannot be cheated (reversedwithai, 2026).</w:t>
       </w:r>
     </w:p>
     <w:p>
@@ -2345,7 +2315,7 @@
           <w:color w:val="000000"/>
           <w:sz w:val="22"/>
         </w:rPr>
-        <w:t>Table 4.1: Comparison of compiled-game mashup techniques.</w:t>
+        <w:t>Table 4.1: Comparison of compiled-game modification techniques.</w:t>
       </w:r>
     </w:p>
     <w:tbl>
@@ -2485,7 +2455,7 @@
                 <w:color w:val="000000"/>
                 <w:sz w:val="20"/>
               </w:rPr>
-              <w:t>Vehicles/weapons as host entities</w:t>
+              <w:t>Items/models as host entities</w:t>
             </w:r>
           </w:p>
         </w:tc>
@@ -2503,7 +2473,7 @@
                 <w:color w:val="000000"/>
                 <w:sz w:val="20"/>
               </w:rPr>
-              <w:t>Format drift; incomplete behavior</w:t>
+              <w:t>Incomplete behavior</w:t>
             </w:r>
           </w:p>
         </w:tc>
@@ -2577,7 +2547,7 @@
                 <w:color w:val="000000"/>
                 <w:sz w:val="20"/>
               </w:rPr>
-              <w:t>Sync bugs; version pin fragility</w:t>
+              <w:t>Sync bugs; version fragility</w:t>
             </w:r>
           </w:p>
         </w:tc>
@@ -2651,7 +2621,7 @@
                 <w:color w:val="000000"/>
                 <w:sz w:val="20"/>
               </w:rPr>
-              <w:t>Behavior mismatch with original</w:t>
+              <w:t>Behavior mismatch</w:t>
             </w:r>
           </w:p>
         </w:tc>
@@ -2671,7 +2641,7 @@
                 <w:color w:val="000000"/>
                 <w:sz w:val="20"/>
               </w:rPr>
-              <w:t>Decomp-as-library</w:t>
+              <w:t>Decomp reuse</w:t>
             </w:r>
           </w:p>
         </w:tc>
@@ -2707,7 +2677,7 @@
                 <w:color w:val="000000"/>
                 <w:sz w:val="20"/>
               </w:rPr>
-              <w:t>Retro characters/engines in hosts</w:t>
+              <w:t>Preservation / embedded logic</w:t>
             </w:r>
           </w:p>
         </w:tc>
@@ -2725,7 +2695,7 @@
                 <w:color w:val="000000"/>
                 <w:sz w:val="20"/>
               </w:rPr>
-              <w:t>Legal/ROM requirements; porting cost</w:t>
+              <w:t>Legal &amp; toolchain cost</w:t>
             </w:r>
           </w:p>
         </w:tc>
@@ -2750,7 +2720,7 @@
           <w:color w:val="000000"/>
           <w:sz w:val="28"/>
         </w:rPr>
-        <w:t>CHAPTER 5: CASE STUDY — GAMES INSIDE GAMES</w:t>
+        <w:t>CHAPTER 5: CASE STUDY — CROSS-GAME BINARY BRIDGES</w:t>
       </w:r>
     </w:p>
     <w:p>
@@ -2766,7 +2736,7 @@
           <w:color w:val="000000"/>
           <w:sz w:val="26"/>
         </w:rPr>
-        <w:t>5.1 Minecraft inside Elden Ring</w:t>
+        <w:t>5.1 Problem Setting</w:t>
       </w:r>
     </w:p>
     <w:p>
@@ -2782,7 +2752,7 @@
           <w:color w:val="000000"/>
           <w:sz w:val="24"/>
         </w:rPr>
-        <w:t>In late 2025–2026, demonstrations of Minecraft running inside Elden Ring became a viral emblem of AI-era modding. Creators showed Steve exploring the Lands Between with Minecraft HUD elements, items, and combat against host enemies (Jacobs demos covered by TweakTown, Decrypt, and IGN, 2026). Not all demos shipped public Windows builds immediately; however, open repositories document a concrete architecture that matches the claims.</w:t>
+        <w:t>The case study asks a concrete question: how can gameplay systems from one closed-source title appear inside another title’s world when neither studio provides source code? Historically, answers were limited to asset swaps or official plugin APIs. Combining two live engines—camera, collision, combat, and rendering—was rare because it required deep binary analysis plus fragile integration code.</w:t>
       </w:r>
     </w:p>
     <w:p>
@@ -2799,7 +2769,39 @@
           <w:color w:val="000000"/>
           <w:sz w:val="24"/>
         </w:rPr>
-        <w:t>The minecraft-crossover-bridge project (and the Windows-oriented Minecraft Ring port) keep Minecraft Java and Elden Ring as separate processes. A Fabric mod captures camera and frames; a native bridge DLL loaded into Elden Ring overwrites camera state, casts rays against host collision, publishes enemy proxies, applies damage through host functions, and composites Minecraft’s image with a depth test (Bustin, 2026; siddoff, 2026). Addresses are validated against expected bytes so mismatched game versions disable features instead of corrupting memory blindly.</w:t>
+        <w:t>Recent open implementations and public demonstrations show that this barrier has dropped. Creators run two compiled games side by side, reverse-engineer enough of each process to exchange state, and present a single composited view. The point for this seminar is technical, not commercial branding: compiled-code modification, not greenfield rewriting.</w:t>
+      </w:r>
+    </w:p>
+    <w:p>
+      <w:pPr>
+        <w:spacing w:before="240" w:after="200"/>
+        <w:jc w:val="left"/>
+      </w:pPr>
+      <w:r>
+        <w:rPr>
+          <w:rFonts w:ascii="Times New Roman" w:hAnsi="Times New Roman" w:eastAsia="Times New Roman"/>
+          <w:b/>
+          <w:i w:val="0"/>
+          <w:color w:val="000000"/>
+          <w:sz w:val="26"/>
+        </w:rPr>
+        <w:t>5.2 Architecture of a Runtime Bridge</w:t>
+      </w:r>
+    </w:p>
+    <w:p>
+      <w:pPr>
+        <w:spacing w:after="160" w:before="0" w:line="360" w:lineRule="auto"/>
+        <w:jc w:val="both"/>
+      </w:pPr>
+      <w:r>
+        <w:rPr>
+          <w:rFonts w:ascii="Times New Roman" w:hAnsi="Times New Roman" w:eastAsia="Times New Roman"/>
+          <w:b w:val="0"/>
+          <w:i w:val="0"/>
+          <w:color w:val="000000"/>
+          <w:sz w:val="24"/>
+        </w:rPr>
+        <w:t>A representative architecture keeps both games as separate processes. The guest side captures player pose and rendered frames. The host side receives that pose, overwrites its camera, casts rays against its own collision, publishes nearby entities, and applies damage through existing host functions. Shared memory or IPC carries the protocol. A depth test merges pixels so guest geometry respects host walls. Addresses are often validated against expected byte patterns so mismatched builds disable features instead of corrupting memory blindly.</w:t>
       </w:r>
     </w:p>
     <w:p>
@@ -2816,19 +2818,19 @@
           <w:color w:val="000000"/>
           <w:sz w:val="20"/>
         </w:rPr>
-        <w:t>Minecraft (player + blocks + HUD)</w:t>
+        <w:t>Guest (player systems)</w:t>
         <w:br/>
-        <w:t xml:space="preserve">   | shared memory: pose, RGBA, depth</w:t>
+        <w:t xml:space="preserve">   | shared memory: pose, frames, events</w:t>
         <w:br/>
         <w:t xml:space="preserve">   v</w:t>
         <w:br/>
-        <w:t>Bridge DLL in Elden Ring</w:t>
+        <w:t>Bridge (hooks + protocol)</w:t>
         <w:br/>
-        <w:t xml:space="preserve">   | overwrite camera | raycast terrain | proxy enemies</w:t>
+        <w:t xml:space="preserve">   | camera overwrite | raycasts | entity proxies | damage calls</w:t>
         <w:br/>
         <w:t xml:space="preserve">   v</w:t>
         <w:br/>
-        <w:t>Elden Ring presents composited frame (offline / no EAC path)</w:t>
+        <w:t>Host (world + renderer) --&gt; composited frame</w:t>
       </w:r>
     </w:p>
     <w:p>
@@ -2844,7 +2846,7 @@
           <w:color w:val="000000"/>
           <w:sz w:val="22"/>
         </w:rPr>
-        <w:t>Figure 5.1: Conceptual data flow in a Minecraft–Elden Ring style bridge.</w:t>
+        <w:t>Figure 5.1: Data flow in a cross-game runtime bridge.</w:t>
       </w:r>
     </w:p>
     <w:p>
@@ -2860,7 +2862,7 @@
           <w:color w:val="000000"/>
           <w:sz w:val="26"/>
         </w:rPr>
-        <w:t>5.2 The 2026 Mashup Wave and Related Work</w:t>
+        <w:t>5.3 Role of AI in Making It Practical</w:t>
       </w:r>
     </w:p>
     <w:p>
@@ -2876,7 +2878,7 @@
           <w:color w:val="000000"/>
           <w:sz w:val="24"/>
         </w:rPr>
-        <w:t>Press coverage described a broader wave of “vibe-coded” mashups: skateboarding systems in Modern Warfare 2 maps, Mario Kart vehicles in Call of Duty: World at War Zombies, Spider-Man traversal in Arkham City spaces, and Escape from Tarkov-inspired systems in Skyrim (Thomas/IGN, 2026; Decrypt, 2026). Tooling write-ups such as Universal Modder’s mashup skill catalog four routes—content port, passthrough, headless rules, and decomp-as-library—and record field notes for dozens of combinations (Sheikh, 2026). Separately, CS2-style movement and gunplay conversions of offline Elden Ring illustrate injection-heavy single-host redesigns rather than dual-process compositing.</w:t>
+        <w:t>AI does not magically invent two game engines. It accelerates the reverse-engineering and glue layers: locating functions, drafting hook code, designing shared-memory layouts, diagnosing sync bugs, and iterating until behavior looks correct. Coding agents paired with decompilers shorten what used to be months of specialist work into much shorter build–test cycles (Sheikh, 2026; Lewis, 2026).</w:t>
       </w:r>
     </w:p>
     <w:p>
@@ -2893,7 +2895,7 @@
           <w:color w:val="000000"/>
           <w:sz w:val="24"/>
         </w:rPr>
-        <w:t>For academic clarity: older Counter-Strike Mario Kart maps (AMX Mod X era) are scripted gameplay transformations on Source/GoldSrc plugin APIs. They are historically interesting but should not be conflated with binary-level passthrough mashups of 2026. The seminar’s focus remains compiled-engine instrumentation accelerated by AI-assisted reverse engineering.</w:t>
+        <w:t>Honesty matters for academic work: many viral clips are demonstrations; fully documented, reproducible bridges are fewer. Version pinning, depth compositing edge cases, and offline-only constraints remain hard. AI lowers the expertise floor; it does not remove engineering judgment.</w:t>
       </w:r>
     </w:p>
     <w:p>
@@ -2909,7 +2911,7 @@
           <w:color w:val="000000"/>
           <w:sz w:val="22"/>
         </w:rPr>
-        <w:t>Table 5.1: Case-study examples and their enabling techniques.</w:t>
+        <w:t>Table 5.1: Case-study elements and enabling techniques.</w:t>
       </w:r>
     </w:p>
     <w:tbl>
@@ -2939,7 +2941,7 @@
                 <w:color w:val="000000"/>
                 <w:sz w:val="20"/>
               </w:rPr>
-              <w:t>Example</w:t>
+              <w:t>Element</w:t>
             </w:r>
           </w:p>
         </w:tc>
@@ -2957,7 +2959,7 @@
                 <w:color w:val="000000"/>
                 <w:sz w:val="20"/>
               </w:rPr>
-              <w:t>Primary Technique</w:t>
+              <w:t>Technique</w:t>
             </w:r>
           </w:p>
         </w:tc>
@@ -2975,7 +2977,7 @@
                 <w:color w:val="000000"/>
                 <w:sz w:val="20"/>
               </w:rPr>
-              <w:t>AI Role (typical)</w:t>
+              <w:t>AI Contribution</w:t>
             </w:r>
           </w:p>
         </w:tc>
@@ -2993,7 +2995,7 @@
                 <w:color w:val="000000"/>
                 <w:sz w:val="20"/>
               </w:rPr>
-              <w:t>Notes</w:t>
+              <w:t>Still Hard</w:t>
             </w:r>
           </w:p>
         </w:tc>
@@ -3013,7 +3015,7 @@
                 <w:color w:val="000000"/>
                 <w:sz w:val="20"/>
               </w:rPr>
-              <w:t>Minecraft ↔ Elden Ring</w:t>
+              <w:t>Two live binaries</w:t>
             </w:r>
           </w:p>
         </w:tc>
@@ -3031,7 +3033,7 @@
                 <w:color w:val="000000"/>
                 <w:sz w:val="20"/>
               </w:rPr>
-              <w:t>Passthrough bridge</w:t>
+              <w:t>Passthrough / IPC bridge</w:t>
             </w:r>
           </w:p>
         </w:tc>
@@ -3049,7 +3051,7 @@
                 <w:color w:val="000000"/>
                 <w:sz w:val="20"/>
               </w:rPr>
-              <w:t>Glue code, address/protocol iteration</w:t>
+              <w:t>Protocol + hook drafting</w:t>
             </w:r>
           </w:p>
         </w:tc>
@@ -3067,7 +3069,7 @@
                 <w:color w:val="000000"/>
                 <w:sz w:val="20"/>
               </w:rPr>
-              <w:t>Public bridge code available</w:t>
+              <w:t>Version fragility</w:t>
             </w:r>
           </w:p>
         </w:tc>
@@ -3087,7 +3089,7 @@
                 <w:color w:val="000000"/>
                 <w:sz w:val="20"/>
               </w:rPr>
-              <w:t>Mario Kart in CoD Zombies</w:t>
+              <w:t>Shared camera/collision</w:t>
             </w:r>
           </w:p>
         </w:tc>
@@ -3105,7 +3107,7 @@
                 <w:color w:val="000000"/>
                 <w:sz w:val="20"/>
               </w:rPr>
-              <w:t>Passthrough / injected systems</w:t>
+              <w:t>Memory hooks + raycasts</w:t>
             </w:r>
           </w:p>
         </w:tc>
@@ -3123,7 +3125,7 @@
                 <w:color w:val="000000"/>
                 <w:sz w:val="20"/>
               </w:rPr>
-              <w:t>Rapid prototype glue</w:t>
+              <w:t>Faster address discovery</w:t>
             </w:r>
           </w:p>
         </w:tc>
@@ -3141,7 +3143,7 @@
                 <w:color w:val="000000"/>
                 <w:sz w:val="20"/>
               </w:rPr>
-              <w:t>Mostly demo clips in press</w:t>
+              <w:t>Correct struct layouts</w:t>
             </w:r>
           </w:p>
         </w:tc>
@@ -3161,7 +3163,7 @@
                 <w:color w:val="000000"/>
                 <w:sz w:val="20"/>
               </w:rPr>
-              <w:t>SM64 Mario in modern hosts</w:t>
+              <w:t>Visual merge</w:t>
             </w:r>
           </w:p>
         </w:tc>
@@ -3179,7 +3181,7 @@
                 <w:color w:val="000000"/>
                 <w:sz w:val="20"/>
               </w:rPr>
-              <w:t>Decomp-as-library</w:t>
+              <w:t>Depth-tested compositing</w:t>
             </w:r>
           </w:p>
         </w:tc>
@@ -3197,7 +3199,7 @@
                 <w:color w:val="000000"/>
                 <w:sz w:val="20"/>
               </w:rPr>
-              <w:t>Optional; decomp was human-led</w:t>
+              <w:t>Debug iteration</w:t>
             </w:r>
           </w:p>
         </w:tc>
@@ -3215,7 +3217,7 @@
                 <w:color w:val="000000"/>
                 <w:sz w:val="20"/>
               </w:rPr>
-              <w:t>Requires user-supplied ROM</w:t>
+              <w:t>Edge cases / timing</w:t>
             </w:r>
           </w:p>
         </w:tc>
@@ -3235,7 +3237,7 @@
                 <w:color w:val="000000"/>
                 <w:sz w:val="20"/>
               </w:rPr>
-              <w:t>Snowboard Kids 2 matching</w:t>
+              <w:t>Preservation twin</w:t>
             </w:r>
           </w:p>
         </w:tc>
@@ -3253,7 +3255,7 @@
                 <w:color w:val="000000"/>
                 <w:sz w:val="20"/>
               </w:rPr>
-              <w:t>Agent + objdiff oracle</w:t>
+              <w:t>Matching decomp + objdiff</w:t>
             </w:r>
           </w:p>
         </w:tc>
@@ -3289,13 +3291,34 @@
                 <w:color w:val="000000"/>
                 <w:sz w:val="20"/>
               </w:rPr>
-              <w:t>Preservation, not mashup</w:t>
+              <w:t>Oracle discipline</w:t>
             </w:r>
           </w:p>
         </w:tc>
       </w:tr>
     </w:tbl>
     <w:p/>
+    <w:p>
+      <w:r>
+        <w:br w:type="page"/>
+      </w:r>
+    </w:p>
+    <w:p>
+      <w:pPr>
+        <w:spacing w:before="360" w:after="200"/>
+        <w:jc w:val="left"/>
+      </w:pPr>
+      <w:r>
+        <w:rPr>
+          <w:rFonts w:ascii="Times New Roman" w:hAnsi="Times New Roman" w:eastAsia="Times New Roman"/>
+          <w:b/>
+          <w:i w:val="0"/>
+          <w:color w:val="000000"/>
+          <w:sz w:val="28"/>
+        </w:rPr>
+        <w:t>CHAPTER 6: CHALLENGES, LIMITS, AND ETHICS</w:t>
+      </w:r>
+    </w:p>
     <w:p>
       <w:pPr>
         <w:spacing w:before="240" w:after="200"/>
@@ -3309,7 +3332,7 @@
           <w:color w:val="000000"/>
           <w:sz w:val="26"/>
         </w:rPr>
-        <w:t>5.3 What Became Easier—and What Did Not</w:t>
+        <w:t>6.1 Correctness and Obfuscation</w:t>
       </w:r>
     </w:p>
     <w:p>
@@ -3325,28 +3348,7 @@
           <w:color w:val="000000"/>
           <w:sz w:val="24"/>
         </w:rPr>
-        <w:t>What became easier is the middle of the stack: proposing hook code, drafting shared-memory protocols, renaming decompiled functions, and iterating on compile–diff loops. What remains hard is everything that still needs ground truth—correct struct layouts, anti-cheat avoidance policies (most serious projects stay offline), version pinning, depth compositing edge cases, and legal redistribution of assets. Many viral clips are demonstrations; open, reproducible bridges are the minority (heyaican analysis, 2026). AI lowers the expertise floor; it does not grant a free pass on verification or rights.</w:t>
-      </w:r>
-    </w:p>
-    <w:p>
-      <w:r>
-        <w:br w:type="page"/>
-      </w:r>
-    </w:p>
-    <w:p>
-      <w:pPr>
-        <w:spacing w:before="360" w:after="200"/>
-        <w:jc w:val="left"/>
-      </w:pPr>
-      <w:r>
-        <w:rPr>
-          <w:rFonts w:ascii="Times New Roman" w:hAnsi="Times New Roman" w:eastAsia="Times New Roman"/>
-          <w:b/>
-          <w:i w:val="0"/>
-          <w:color w:val="000000"/>
-          <w:sz w:val="28"/>
-        </w:rPr>
-        <w:t>CHAPTER 6: LIMITATIONS, ETHICS, AND OPEN CHALLENGES</w:t>
+        <w:t>LLM assistants invent plausible types, comments, and protocol fields. Without a fixed oracle—tests, re-execution, or byte-identical diffs—agents may optimize for looking finished rather than being correct (reversedwithai, 2026). Obfuscation, packing, and heavy optimization still defeat both classical and neural decompilers. Best practice is dual control: AI proposes, classical tools measure, humans approve.</w:t>
       </w:r>
     </w:p>
     <w:p>
@@ -3362,7 +3364,7 @@
           <w:color w:val="000000"/>
           <w:sz w:val="26"/>
         </w:rPr>
-        <w:t>6.1 Hallucinations, Obfuscation, and Verification</w:t>
+        <w:t>6.2 Legal and Ethical Boundaries</w:t>
       </w:r>
     </w:p>
     <w:p>
@@ -3378,28 +3380,13 @@
           <w:color w:val="000000"/>
           <w:sz w:val="24"/>
         </w:rPr>
-        <w:t>LLM assistants invent plausible types, comments, and even protocol fields. Without a fixed oracle—unit tests, re-executability checks, or byte-identical object diffs—agents have been observed to “cheat” by forking compilers or editing verification scripts (reversedwithai, 2026). Obfuscation and heavy optimization continue to defeat both classical and neural decompilers. Best practice is dual control: AI proposes, classical tools measure, humans approve.</w:t>
+        <w:t>Reverse engineering for interoperability has limited legal traditions in some jurisdictions, but license agreements, anti-circumvention rules, and publisher policies still constrain many workflows (EFF, n.d.). Combining commercial titles’ code and assets without rights raises redistribution problems. Anti-cheat systems are another hard boundary: responsible discussion treats online multiplayer bypass as out of scope and emphasizes offline experimentation that does not ship proprietary game files.</w:t>
       </w:r>
     </w:p>
     <w:p>
       <w:pPr>
-        <w:spacing w:before="240" w:after="200"/>
-        <w:jc w:val="left"/>
-      </w:pPr>
-      <w:r>
-        <w:rPr>
-          <w:rFonts w:ascii="Times New Roman" w:hAnsi="Times New Roman" w:eastAsia="Times New Roman"/>
-          <w:b/>
-          <w:i w:val="0"/>
-          <w:color w:val="000000"/>
-          <w:sz w:val="26"/>
-        </w:rPr>
-        <w:t>6.2 Copyright, Anti-Cheat, and Community Norms</w:t>
-      </w:r>
-    </w:p>
-    <w:p>
-      <w:pPr>
         <w:spacing w:after="160" w:before="0" w:line="360" w:lineRule="auto"/>
+        <w:ind w:firstLine="432"/>
         <w:jc w:val="both"/>
       </w:pPr>
       <w:r>
@@ -3410,24 +3397,7 @@
           <w:color w:val="000000"/>
           <w:sz w:val="24"/>
         </w:rPr>
-        <w:t>Reverse engineering for interoperability has limited legal traditions in some jurisdictions (for example, fair-use discussion around Sega v. Accolade; DMCA §1201(f) interoperability exceptions in U.S. law), but EULAs, anti-circumvention rules, and game publisher policies still constrain many workflows (EFF, n.d.). Mashups that combine two commercial titles’ code and assets without licenses raise clear redistribution problems; platforms such as Nexus Mods discourage AI-assisted uploads that lack rights to the underlying assets (IGN summary, 2026).</w:t>
-      </w:r>
-    </w:p>
-    <w:p>
-      <w:pPr>
-        <w:spacing w:after="160" w:before="0" w:line="360" w:lineRule="auto"/>
-        <w:ind w:firstLine="432"/>
-        <w:jc w:val="both"/>
-      </w:pPr>
-      <w:r>
-        <w:rPr>
-          <w:rFonts w:ascii="Times New Roman" w:hAnsi="Times New Roman" w:eastAsia="Times New Roman"/>
-          <w:b w:val="0"/>
-          <w:i w:val="0"/>
-          <w:color w:val="000000"/>
-          <w:sz w:val="24"/>
-        </w:rPr>
-        <w:t>Anti-cheat systems are another hard boundary. Documented bridges emphasize offline launches and never shipping game files. Responsible seminar discussion should treat online multiplayer bypass as out of scope. Finally, parts of the traditional modding community criticize viral mashups as engagement-driven “slop,” arguing that sustainable creativity still requires craft and respect for original works (Thomas/IGN, 2026). AI capability and community legitimacy are not the same variable.</w:t>
+        <w:t>Finally, community norms matter. Speed alone is not craft. Sustainable technical work still requires verification, respect for original creators, and clear separation between research prototypes and redistributable products.</w:t>
       </w:r>
     </w:p>
     <w:p>
@@ -3464,7 +3434,7 @@
           <w:color w:val="000000"/>
           <w:sz w:val="24"/>
         </w:rPr>
-        <w:t>Artificial intelligence is transforming software reverse engineering by attacking its slowest human stages: naming, typing, explaining, and iterating candidate patches against binaries. Specialized models and in-tool agents produce measurable gains on decompilation benchmarks and dramatically accelerate game preservation and experimental modding. Yet the foundation remains classical analysis—bytes, control flow, and verification oracles.</w:t>
+        <w:t>Artificial intelligence is transforming software reverse engineering by attacking its slowest human stages: naming, typing, explaining, and iterating candidate patches against binaries. Classical tools remain the foundation; AI compresses analysis time on top of them.</w:t>
       </w:r>
     </w:p>
     <w:p>
@@ -3481,7 +3451,7 @@
           <w:color w:val="000000"/>
           <w:sz w:val="24"/>
         </w:rPr>
-        <w:t>Video games make the transformation vivid. Projects that place Minecraft systems inside Elden Ring, or that match console functions with agent loops, show that ambitious modification of compiled code is no longer reserved for multi-year specialist teams alone. The correct story is not that AI rewrites games from imagination; it is that AI makes reverse engineering efficient enough for new classes of binary-level composition.</w:t>
+        <w:t>Video games make the shift concrete. Cross-game runtime bridges show that ambitious modification of compiled code—once reserved for multi-year specialist teams—can become comparatively practical when reverse engineering is accelerated by LLMs and agents. The correct story is not that AI rewrites games from imagination; it is that AI makes reverse engineering efficient enough for new classes of binary-level composition.</w:t>
       </w:r>
     </w:p>
     <w:p>
@@ -3498,7 +3468,7 @@
           <w:color w:val="000000"/>
           <w:sz w:val="24"/>
         </w:rPr>
-        <w:t>For engineers and researchers, the actionable lesson is clear: combine LLM assistance with Ghidra/IDA-class tooling, insist on automated checks, and treat legal and ethical constraints as first-class design inputs. Under those conditions, AI-powered reverse engineering is a durable direction for security, preservation, and creative systems research.</w:t>
+        <w:t>For students and practitioners, the lesson is clear: combine LLM assistance with Ghidra/IDA-class tooling, insist on automated checks, and treat legal and ethical constraints as first-class design inputs. Under those conditions, AI-powered reverse engineering is a durable direction for security, preservation, and creative systems research.</w:t>
       </w:r>
     </w:p>
     <w:p>
@@ -3535,39 +3505,7 @@
           <w:color w:val="000000"/>
           <w:sz w:val="22"/>
         </w:rPr>
-        <w:t>Altimit, A. (2026). Injection Toolkit (ITK) &amp; game mods [Computer software]. GitHub. https://github.com/AndrewAltimit/game-mods</w:t>
-      </w:r>
-    </w:p>
-    <w:p>
-      <w:pPr>
-        <w:spacing w:after="160"/>
-        <w:ind w:left="360" w:hanging="360"/>
-      </w:pPr>
-      <w:r>
-        <w:rPr>
-          <w:rFonts w:ascii="Times New Roman" w:hAnsi="Times New Roman" w:eastAsia="Times New Roman"/>
-          <w:b w:val="0"/>
-          <w:i w:val="0"/>
-          <w:color w:val="000000"/>
-          <w:sz w:val="22"/>
-        </w:rPr>
-        <w:t>Bustin, J. (2026). minecraft-crossover-bridge [Computer software]. GitHub. https://github.com/justbustin/minecraft-crossover-bridge</w:t>
-      </w:r>
-    </w:p>
-    <w:p>
-      <w:pPr>
-        <w:spacing w:after="160"/>
-        <w:ind w:left="360" w:hanging="360"/>
-      </w:pPr>
-      <w:r>
-        <w:rPr>
-          <w:rFonts w:ascii="Times New Roman" w:hAnsi="Times New Roman" w:eastAsia="Times New Roman"/>
-          <w:b w:val="0"/>
-          <w:i w:val="0"/>
-          <w:color w:val="000000"/>
-          <w:sz w:val="22"/>
-        </w:rPr>
-        <w:t>Chen, Q., Lacomis, J., Schwartz, E. J., Le Goues, C., Nebula, &amp; Vasilescu, B. (2022). Augmenting decompiler output with learned variable names and types (DIRTY).</w:t>
+        <w:t>Chen, Q., Lacomis, J., Schwartz, E. J., Le Goues, C., Nebula, &amp; Vasilescu, B. (2022). Augmenting decompiler output with learned variable names and types.</w:t>
       </w:r>
     </w:p>
     <w:p>
@@ -3663,39 +3601,7 @@
           <w:color w:val="000000"/>
           <w:sz w:val="22"/>
         </w:rPr>
-        <w:t>Lacomis, J., et al. (2019). DIRE: A neural approach to decompiled identifier naming. ASE.</w:t>
-      </w:r>
-    </w:p>
-    <w:p>
-      <w:pPr>
-        <w:spacing w:after="160"/>
-        <w:ind w:left="360" w:hanging="360"/>
-      </w:pPr>
-      <w:r>
-        <w:rPr>
-          <w:rFonts w:ascii="Times New Roman" w:hAnsi="Times New Roman" w:eastAsia="Times New Roman"/>
-          <w:b w:val="0"/>
-          <w:i w:val="0"/>
-          <w:color w:val="000000"/>
-          <w:sz w:val="22"/>
-        </w:rPr>
-        <w:t>Lewis, C. (2026). The long tail of LLM-assisted decompilation. https://blog.chrislewis.au/the-long-tail-of-llm-assisted-decompilation/</w:t>
-      </w:r>
-    </w:p>
-    <w:p>
-      <w:pPr>
-        <w:spacing w:after="160"/>
-        <w:ind w:left="360" w:hanging="360"/>
-      </w:pPr>
-      <w:r>
-        <w:rPr>
-          <w:rFonts w:ascii="Times New Roman" w:hAnsi="Times New Roman" w:eastAsia="Times New Roman"/>
-          <w:b w:val="0"/>
-          <w:i w:val="0"/>
-          <w:color w:val="000000"/>
-          <w:sz w:val="22"/>
-        </w:rPr>
-        <w:t>MartianLee. (2026). Inside the bridge that runs Minecraft in Elden Ring. https://martianlee.github.io/</w:t>
+        <w:t>Lewis, C. (2026). The long tail of LLM-assisted decompilation. https://blog.chrislewis.au/</w:t>
       </w:r>
     </w:p>
     <w:p>
@@ -3727,23 +3633,7 @@
           <w:color w:val="000000"/>
           <w:sz w:val="22"/>
         </w:rPr>
-        <w:t>Sheikh, R. (2026). AI game mashups / Universal Modder mashup skill. https://universal-modder.dev/mashup/</w:t>
-      </w:r>
-    </w:p>
-    <w:p>
-      <w:pPr>
-        <w:spacing w:after="160"/>
-        <w:ind w:left="360" w:hanging="360"/>
-      </w:pPr>
-      <w:r>
-        <w:rPr>
-          <w:rFonts w:ascii="Times New Roman" w:hAnsi="Times New Roman" w:eastAsia="Times New Roman"/>
-          <w:b w:val="0"/>
-          <w:i w:val="0"/>
-          <w:color w:val="000000"/>
-          <w:sz w:val="22"/>
-        </w:rPr>
-        <w:t>siddoff. (2026). Minecraft-Ring [Computer software]. GitHub. https://github.com/siddoff/Minecraft-Ring</w:t>
+        <w:t>Sheikh, R. (2026). Mashup patterns for compiled-game bridges / Universal Modder notes. https://universal-modder.dev/mashup/</w:t>
       </w:r>
     </w:p>
     <w:p>
@@ -3775,38 +3665,6 @@
           <w:color w:val="000000"/>
           <w:sz w:val="22"/>
         </w:rPr>
-        <w:t>Thomas, J. (2026, October). Vibe-coded mashup mods have taken over X this week. IGN Nordic.</w:t>
-      </w:r>
-    </w:p>
-    <w:p>
-      <w:pPr>
-        <w:spacing w:after="160"/>
-        <w:ind w:left="360" w:hanging="360"/>
-      </w:pPr>
-      <w:r>
-        <w:rPr>
-          <w:rFonts w:ascii="Times New Roman" w:hAnsi="Times New Roman" w:eastAsia="Times New Roman"/>
-          <w:b w:val="0"/>
-          <w:i w:val="0"/>
-          <w:color w:val="000000"/>
-          <w:sz w:val="22"/>
-        </w:rPr>
-        <w:t>TweakTown / Decrypt. (2026). Coverage of Minecraft-in-Elden-Ring and related AI mashup mods.</w:t>
-      </w:r>
-    </w:p>
-    <w:p>
-      <w:pPr>
-        <w:spacing w:after="160"/>
-        <w:ind w:left="360" w:hanging="360"/>
-      </w:pPr>
-      <w:r>
-        <w:rPr>
-          <w:rFonts w:ascii="Times New Roman" w:hAnsi="Times New Roman" w:eastAsia="Times New Roman"/>
-          <w:b w:val="0"/>
-          <w:i w:val="0"/>
-          <w:color w:val="000000"/>
-          <w:sz w:val="22"/>
-        </w:rPr>
         <w:t>Vector 35. (2024). Binary Ninja Sidekick 1.0. https://sidekick.binary.ninja/</w:t>
       </w:r>
     </w:p>
@@ -3840,22 +3698,6 @@
           <w:sz w:val="22"/>
         </w:rPr>
         <w:t>Wiseguy, M. (2024). N64: Recompiled [Computer software]. https://github.com/Mr-Wiseguy/N64Recomp</w:t>
-      </w:r>
-    </w:p>
-    <w:p>
-      <w:pPr>
-        <w:spacing w:after="160"/>
-        <w:ind w:left="360" w:hanging="360"/>
-      </w:pPr>
-      <w:r>
-        <w:rPr>
-          <w:rFonts w:ascii="Times New Roman" w:hAnsi="Times New Roman" w:eastAsia="Times New Roman"/>
-          <w:b w:val="0"/>
-          <w:i w:val="0"/>
-          <w:color w:val="000000"/>
-          <w:sz w:val="22"/>
-        </w:rPr>
-        <w:t>Xie, D., et al. (2024). ReSym: Harnessing LLMs to recover variable and data structure symbols from stripped binaries. ACM CCS.</w:t>
       </w:r>
     </w:p>
     <w:sectPr>

</xml_diff>